<commit_message>
Comptoir: fix crowdfunding fee (7%) in ep58-59 and Henri alive in ep73; rebuild
Co-Authored-By: Claude Sonnet 5.5 <noreply@anthropic.com>
Claude-Session: https://claude.ai/code/session_01JC5NKfFVw6UQskerPFT2xC
</commit_message>
<xml_diff>
--- a/comptoir/part4/ep58_Reveillon_au_Comptoir.docx
+++ b/comptoir/part4/ep58_Reveillon_au_Comptoir.docx
@@ -1856,7 +1856,7 @@
           <w:sz w:val="22"/>
         </w:rPr>
         <w:tab/>
-        <w:t>Après les frais de la plateforme, il nous reste environ 40 360 euros.</w:t>
+        <w:t>Après les frais de la plateforme, il nous reste environ 40 800 euros.</w:t>
       </w:r>
     </w:p>
     <w:p>
@@ -1882,7 +1882,7 @@
           <w:sz w:val="22"/>
         </w:rPr>
         <w:tab/>
-        <w:t>Ça fait huit pour cent de frais, soit 3 510 euros. Ce n'est pas rien.</w:t>
+        <w:t>Ça fait sept pour cent de frais, soit 3 070 euros. Ce n'est pas rien.</w:t>
       </w:r>
     </w:p>
     <w:p>
@@ -4674,7 +4674,7 @@
                 <w:b w:val="0"/>
                 <w:sz w:val="19"/>
               </w:rPr>
-              <w:t>« Après les frais, il nous reste 40 360 euros. » frais 는 늘 복수. rester = 남다. 8 % 수수료는 « huit pour cent ».</w:t>
+              <w:t>« Après les frais, il nous reste 40 800 euros. » frais 는 늘 복수. rester = 남다. 7 % 수수료는 « sept pour cent ».</w:t>
             </w:r>
           </w:p>
         </w:tc>
@@ -5788,7 +5788,7 @@
           <w:rFonts w:ascii="Calibri" w:hAnsi="Calibri" w:eastAsia="Malgun Gothic"/>
           <w:sz w:val="20"/>
         </w:rPr>
-        <w:t>« On l'a dépassé de 3 870 euros. » « Huit pour cent de frais, soit 3 510 euros. » « Il nous reste environ 40 360 euros. » dépasser de + 금액, soit = 즉, il reste = 남아 있다. 모금 총액 43 870 - 3 510(약) = 약 40 360.</w:t>
+        <w:t>« On l'a dépassé de 3 870 euros. » « Sept pour cent de frais, soit 3 070 euros. » « Il nous reste environ 40 800 euros. » dépasser de + 금액, soit = 즉, il reste = 남아 있다. 모금 총액 43 870 - 3 070(약) = 약 40 800.</w:t>
       </w:r>
     </w:p>
     <w:p>
@@ -6165,7 +6165,7 @@
           <w:rFonts w:ascii="Calibri" w:hAnsi="Calibri" w:eastAsia="Malgun Gothic"/>
           <w:sz w:val="20"/>
         </w:rPr>
-        <w:t>프랑스에서는 Ulule, KissKissBankBank 같은 플랫폼에서 작은 가게가 « contreparties(보상) » 를 약속하고 후원을 모은다. 성공하면 수수료(약 5~8 %)를 뗀 금액을 받는다. 동네 단골이 후원자가 되기 때문에, 모금은 돈 이상으로 공동체의 지지 표현이기도 하다.</w:t>
+        <w:t>프랑스에서는 Ulule, KissKissBankBank 같은 플랫폼에서 작은 가게가 « contreparties(보상) » 를 약속하고 후원을 모은다. 성공하면 수수료(약 5~7 %)를 뗀 금액을 받는다. 동네 단골이 후원자가 되기 때문에, 모금은 돈 이상으로 공동체의 지지 표현이기도 하다.</w:t>
       </w:r>
     </w:p>
     <w:p>
@@ -7761,7 +7761,7 @@
           <w:sz w:val="21"/>
         </w:rPr>
         <w:tab/>
-        <w:t>플랫폼 수수료를 빼면 약 40 360유로가 남아요.</w:t>
+        <w:t>플랫폼 수수료를 빼면 약 40 800유로가 남아요.</w:t>
       </w:r>
     </w:p>
     <w:p>
@@ -7787,7 +7787,7 @@
           <w:sz w:val="21"/>
         </w:rPr>
         <w:tab/>
-        <w:t>수수료가 8퍼센트, 즉 3 510유로야. 적은 돈은 아니지.</w:t>
+        <w:t>수수료가 7퍼센트, 즉 3 070유로야. 적은 돈은 아니지.</w:t>
       </w:r>
     </w:p>
     <w:p>

</xml_diff>